<commit_message>
Bolo Town joint sample info: add VA group (Pompleh & Wehyee) observations and photo plates
Co-authored-by: arena-agent <297053741+arena-agent@users.noreply.github.com>
</commit_message>
<xml_diff>
--- a/bolo-town/BOLO TOWN SAMPLE INFORMATION (Joint) - with ES observations.docx
+++ b/bolo-town/BOLO TOWN SAMPLE INFORMATION (Joint) - with ES observations.docx
@@ -910,6 +910,7 @@
         <w:tc>
           <w:tcPr>
             <w:tcW w:type="dxa" w:w="2448"/>
+            <w:shd w:val="clear" w:color="auto" w:fill="F2F2F2"/>
           </w:tcPr>
           <w:p>
             <w:r/>
@@ -925,6 +926,7 @@
         <w:tc>
           <w:tcPr>
             <w:tcW w:type="dxa" w:w="1656"/>
+            <w:shd w:val="clear" w:color="auto" w:fill="F2F2F2"/>
           </w:tcPr>
           <w:p>
             <w:pPr>
@@ -943,6 +945,7 @@
         <w:tc>
           <w:tcPr>
             <w:tcW w:type="dxa" w:w="1224"/>
+            <w:shd w:val="clear" w:color="auto" w:fill="F2F2F2"/>
           </w:tcPr>
           <w:p>
             <w:pPr>
@@ -961,6 +964,7 @@
         <w:tc>
           <w:tcPr>
             <w:tcW w:type="dxa" w:w="1296"/>
+            <w:shd w:val="clear" w:color="auto" w:fill="F2F2F2"/>
           </w:tcPr>
           <w:p>
             <w:pPr>
@@ -979,6 +983,7 @@
         <w:tc>
           <w:tcPr>
             <w:tcW w:type="dxa" w:w="1152"/>
+            <w:shd w:val="clear" w:color="auto" w:fill="F2F2F2"/>
           </w:tcPr>
           <w:p>
             <w:pPr>
@@ -997,18 +1002,16 @@
         <w:tc>
           <w:tcPr>
             <w:tcW w:type="dxa" w:w="6192"/>
+            <w:shd w:val="clear" w:color="auto" w:fill="F2F2F2"/>
           </w:tcPr>
           <w:p>
-            <w:pPr>
-              <w:jc w:val="center"/>
-            </w:pPr>
             <w:r/>
             <w:r>
               <w:rPr>
                 <w:b w:val="0"/>
                 <w:sz w:val="17"/>
               </w:rPr>
-              <w:t>—</w:t>
+              <w:t>Downstream surface water sample collected along the Wehyee stream within a densely vegetated channel. Water was brownish to reddish-brown and visibly turbid, with suspended particles and sediment apparent in the flowing water. No visible sign of mine-runoff pollution was observed on the nearby farmland.</w:t>
             </w:r>
           </w:p>
         </w:tc>
@@ -1017,6 +1020,7 @@
         <w:tc>
           <w:tcPr>
             <w:tcW w:type="dxa" w:w="2448"/>
+            <w:shd w:val="clear" w:color="auto" w:fill="F2F2F2"/>
           </w:tcPr>
           <w:p>
             <w:r/>
@@ -1032,6 +1036,7 @@
         <w:tc>
           <w:tcPr>
             <w:tcW w:type="dxa" w:w="1656"/>
+            <w:shd w:val="clear" w:color="auto" w:fill="F2F2F2"/>
           </w:tcPr>
           <w:p>
             <w:pPr>
@@ -1050,6 +1055,7 @@
         <w:tc>
           <w:tcPr>
             <w:tcW w:type="dxa" w:w="1224"/>
+            <w:shd w:val="clear" w:color="auto" w:fill="F2F2F2"/>
           </w:tcPr>
           <w:p>
             <w:pPr>
@@ -1068,6 +1074,7 @@
         <w:tc>
           <w:tcPr>
             <w:tcW w:type="dxa" w:w="1296"/>
+            <w:shd w:val="clear" w:color="auto" w:fill="F2F2F2"/>
           </w:tcPr>
           <w:p>
             <w:pPr>
@@ -1086,6 +1093,7 @@
         <w:tc>
           <w:tcPr>
             <w:tcW w:type="dxa" w:w="1152"/>
+            <w:shd w:val="clear" w:color="auto" w:fill="F2F2F2"/>
           </w:tcPr>
           <w:p>
             <w:pPr>
@@ -1104,18 +1112,16 @@
         <w:tc>
           <w:tcPr>
             <w:tcW w:type="dxa" w:w="6192"/>
+            <w:shd w:val="clear" w:color="auto" w:fill="F2F2F2"/>
           </w:tcPr>
           <w:p>
-            <w:pPr>
-              <w:jc w:val="center"/>
-            </w:pPr>
             <w:r/>
             <w:r>
               <w:rPr>
                 <w:b w:val="0"/>
                 <w:sz w:val="17"/>
               </w:rPr>
-              <w:t>—</w:t>
+              <w:t>Mid-point surface water sample collected along the Wehyee stream to assess spatial variation in sediment load. The stream was turbid and reddish-brown, with uneven banks showing exposed soil, roots and localised erosion along the channel.</w:t>
             </w:r>
           </w:p>
         </w:tc>
@@ -1124,6 +1130,7 @@
         <w:tc>
           <w:tcPr>
             <w:tcW w:type="dxa" w:w="2448"/>
+            <w:shd w:val="clear" w:color="auto" w:fill="F2F2F2"/>
           </w:tcPr>
           <w:p>
             <w:r/>
@@ -1139,6 +1146,7 @@
         <w:tc>
           <w:tcPr>
             <w:tcW w:type="dxa" w:w="1656"/>
+            <w:shd w:val="clear" w:color="auto" w:fill="F2F2F2"/>
           </w:tcPr>
           <w:p>
             <w:pPr>
@@ -1157,6 +1165,7 @@
         <w:tc>
           <w:tcPr>
             <w:tcW w:type="dxa" w:w="1224"/>
+            <w:shd w:val="clear" w:color="auto" w:fill="F2F2F2"/>
           </w:tcPr>
           <w:p>
             <w:pPr>
@@ -1175,6 +1184,7 @@
         <w:tc>
           <w:tcPr>
             <w:tcW w:type="dxa" w:w="1296"/>
+            <w:shd w:val="clear" w:color="auto" w:fill="F2F2F2"/>
           </w:tcPr>
           <w:p>
             <w:pPr>
@@ -1193,6 +1203,7 @@
         <w:tc>
           <w:tcPr>
             <w:tcW w:type="dxa" w:w="1152"/>
+            <w:shd w:val="clear" w:color="auto" w:fill="F2F2F2"/>
           </w:tcPr>
           <w:p>
             <w:pPr>
@@ -1211,18 +1222,16 @@
         <w:tc>
           <w:tcPr>
             <w:tcW w:type="dxa" w:w="6192"/>
+            <w:shd w:val="clear" w:color="auto" w:fill="F2F2F2"/>
           </w:tcPr>
           <w:p>
-            <w:pPr>
-              <w:jc w:val="center"/>
-            </w:pPr>
             <w:r/>
             <w:r>
               <w:rPr>
                 <w:b w:val="0"/>
                 <w:sz w:val="17"/>
               </w:rPr>
-              <w:t>—</w:t>
+              <w:t>Upstream surface water sample collected on the Wehyee stream above the mid-point and downstream stations. Water remained discoloured and turbid under dense tree, shrub and fern cover; disturbed bank sections with exposed soils were noted as possible local sediment sources.</w:t>
             </w:r>
           </w:p>
         </w:tc>
@@ -1231,6 +1240,7 @@
         <w:tc>
           <w:tcPr>
             <w:tcW w:type="dxa" w:w="2448"/>
+            <w:shd w:val="clear" w:color="auto" w:fill="F2F2F2"/>
           </w:tcPr>
           <w:p>
             <w:r/>
@@ -1246,6 +1256,7 @@
         <w:tc>
           <w:tcPr>
             <w:tcW w:type="dxa" w:w="1656"/>
+            <w:shd w:val="clear" w:color="auto" w:fill="F2F2F2"/>
           </w:tcPr>
           <w:p>
             <w:pPr>
@@ -1264,6 +1275,7 @@
         <w:tc>
           <w:tcPr>
             <w:tcW w:type="dxa" w:w="1224"/>
+            <w:shd w:val="clear" w:color="auto" w:fill="F2F2F2"/>
           </w:tcPr>
           <w:p>
             <w:pPr>
@@ -1282,6 +1294,7 @@
         <w:tc>
           <w:tcPr>
             <w:tcW w:type="dxa" w:w="1296"/>
+            <w:shd w:val="clear" w:color="auto" w:fill="F2F2F2"/>
           </w:tcPr>
           <w:p>
             <w:pPr>
@@ -1300,6 +1313,7 @@
         <w:tc>
           <w:tcPr>
             <w:tcW w:type="dxa" w:w="1152"/>
+            <w:shd w:val="clear" w:color="auto" w:fill="F2F2F2"/>
           </w:tcPr>
           <w:p>
             <w:pPr>
@@ -1318,18 +1332,16 @@
         <w:tc>
           <w:tcPr>
             <w:tcW w:type="dxa" w:w="6192"/>
+            <w:shd w:val="clear" w:color="auto" w:fill="F2F2F2"/>
           </w:tcPr>
           <w:p>
-            <w:pPr>
-              <w:jc w:val="center"/>
-            </w:pPr>
             <w:r/>
             <w:r>
               <w:rPr>
                 <w:b w:val="0"/>
                 <w:sz w:val="17"/>
               </w:rPr>
-              <w:t>—</w:t>
+              <w:t>Downstream surface water sample collected along the Pompleh stream within dense vegetation. Brownish, visibly turbid water with suspended sediment was observed; no visible sign of mine-runoff pollution was noted on the adjacent farmland.</w:t>
             </w:r>
           </w:p>
         </w:tc>
@@ -1338,6 +1350,7 @@
         <w:tc>
           <w:tcPr>
             <w:tcW w:type="dxa" w:w="2448"/>
+            <w:shd w:val="clear" w:color="auto" w:fill="F2F2F2"/>
           </w:tcPr>
           <w:p>
             <w:r/>
@@ -1353,6 +1366,7 @@
         <w:tc>
           <w:tcPr>
             <w:tcW w:type="dxa" w:w="1656"/>
+            <w:shd w:val="clear" w:color="auto" w:fill="F2F2F2"/>
           </w:tcPr>
           <w:p>
             <w:pPr>
@@ -1371,6 +1385,7 @@
         <w:tc>
           <w:tcPr>
             <w:tcW w:type="dxa" w:w="1224"/>
+            <w:shd w:val="clear" w:color="auto" w:fill="F2F2F2"/>
           </w:tcPr>
           <w:p>
             <w:pPr>
@@ -1389,6 +1404,7 @@
         <w:tc>
           <w:tcPr>
             <w:tcW w:type="dxa" w:w="1296"/>
+            <w:shd w:val="clear" w:color="auto" w:fill="F2F2F2"/>
           </w:tcPr>
           <w:p>
             <w:pPr>
@@ -1407,6 +1423,7 @@
         <w:tc>
           <w:tcPr>
             <w:tcW w:type="dxa" w:w="1152"/>
+            <w:shd w:val="clear" w:color="auto" w:fill="F2F2F2"/>
           </w:tcPr>
           <w:p>
             <w:pPr>
@@ -1425,18 +1442,16 @@
         <w:tc>
           <w:tcPr>
             <w:tcW w:type="dxa" w:w="6192"/>
+            <w:shd w:val="clear" w:color="auto" w:fill="F2F2F2"/>
           </w:tcPr>
           <w:p>
-            <w:pPr>
-              <w:jc w:val="center"/>
-            </w:pPr>
             <w:r/>
             <w:r>
               <w:rPr>
                 <w:b w:val="0"/>
                 <w:sz w:val="17"/>
               </w:rPr>
-              <w:t>—</w:t>
+              <w:t>Mid-point surface water sample collected along the Pompleh stream. The channel was turbid and reddish-brown, flowing through abundant ground vegetation with uneven, partially eroded streambanks.</w:t>
             </w:r>
           </w:p>
         </w:tc>
@@ -1445,6 +1460,7 @@
         <w:tc>
           <w:tcPr>
             <w:tcW w:type="dxa" w:w="2448"/>
+            <w:shd w:val="clear" w:color="auto" w:fill="F2F2F2"/>
           </w:tcPr>
           <w:p>
             <w:r/>
@@ -1460,6 +1476,7 @@
         <w:tc>
           <w:tcPr>
             <w:tcW w:type="dxa" w:w="1656"/>
+            <w:shd w:val="clear" w:color="auto" w:fill="F2F2F2"/>
           </w:tcPr>
           <w:p>
             <w:pPr>
@@ -1478,6 +1495,7 @@
         <w:tc>
           <w:tcPr>
             <w:tcW w:type="dxa" w:w="1224"/>
+            <w:shd w:val="clear" w:color="auto" w:fill="F2F2F2"/>
           </w:tcPr>
           <w:p>
             <w:pPr>
@@ -1496,6 +1514,7 @@
         <w:tc>
           <w:tcPr>
             <w:tcW w:type="dxa" w:w="1296"/>
+            <w:shd w:val="clear" w:color="auto" w:fill="F2F2F2"/>
           </w:tcPr>
           <w:p>
             <w:pPr>
@@ -1514,6 +1533,7 @@
         <w:tc>
           <w:tcPr>
             <w:tcW w:type="dxa" w:w="1152"/>
+            <w:shd w:val="clear" w:color="auto" w:fill="F2F2F2"/>
           </w:tcPr>
           <w:p>
             <w:pPr>
@@ -1532,18 +1552,16 @@
         <w:tc>
           <w:tcPr>
             <w:tcW w:type="dxa" w:w="6192"/>
+            <w:shd w:val="clear" w:color="auto" w:fill="F2F2F2"/>
           </w:tcPr>
           <w:p>
-            <w:pPr>
-              <w:jc w:val="center"/>
-            </w:pPr>
             <w:r/>
             <w:r>
               <w:rPr>
                 <w:b w:val="0"/>
                 <w:sz w:val="17"/>
               </w:rPr>
-              <w:t>—</w:t>
+              <w:t>Surface water sample collected further along the Pompleh stream to evaluate the combined sediment load. Water was discoloured and turbid, with suspended particles consistent with soil erosion and sediment runoff into the stream.</w:t>
             </w:r>
           </w:p>
         </w:tc>
@@ -2545,7 +2563,7 @@
           <w:i/>
           <w:sz w:val="18"/>
         </w:rPr>
-        <w:t>Note: Descriptions for the ES group sampling points (shaded) are derived from “ES Group – Physical Observations at Following Sampling Points”. YWK2 = Yeewa Korweny 2 (Patel); YWK1 = Yeewa Korweny 1 (Dor). Descriptions for the JC and VA group points are to be supplied by those groups.</w:t>
+        <w:t>Note: Descriptions for the shaded rows are derived from the groups’ field notes – “ES Group – Physical Observations at Following Sampling Points” (Emmanuel Suah group; YWK2 = Yeewa Korweny 2 (Patel), YWK1 = Yeewa Korweny 1 (Dor)) and “Team Varney Armah (Pompleh &amp; Wehyee)” (VA group). Descriptions for the JC group points are to be supplied by that group.</w:t>
       </w:r>
     </w:p>
     <w:p/>
@@ -2617,6 +2635,336 @@
         <w:t>Yeewa Korweny 1 and Yeewa Korweny 2 are tributary branches of the Yeewa main stream, situated on opposite sides of the main watercourse. Both originate in the Mount Yewlliton area and flow through deep valleys characterised by dense forest cover. The tributaries were also observed to contain substantial sediment deposits. Their locations are in proximity to ArcelorMittal’s haulage route and to mining activities in the Mount Yewlliton and Mount Gangro areas. The proximity of mining and haulage activities, together with the observed sedimentation, warrants further investigation into possible sediment transport pathways. Nevertheless, the field observations alone do not establish that ArcelorMittal’s activities caused the sedimentation or any chemical pollution.</w:t>
       </w:r>
     </w:p>
+    <w:p/>
+    <w:p>
+      <w:r>
+        <w:rPr>
+          <w:b/>
+          <w:sz w:val="22"/>
+        </w:rPr>
+        <w:t>PHYSICAL OBSERVATIONS AT SAMPLING POINTS – VA GROUP (POMPLEH &amp; WEHYEE)</w:t>
+      </w:r>
+    </w:p>
+    <w:p>
+      <w:r>
+        <w:t>During the field visit on 13 October 2026, the Varney Armah (VA) team conducted surface water sampling along the Wehyee and Pompleh streams in Nimba County. The following preliminary observations were recorded:</w:t>
+      </w:r>
+    </w:p>
+    <w:p>
+      <w:pPr>
+        <w:pStyle w:val="ListBullet"/>
+        <w:spacing w:after="80"/>
+      </w:pPr>
+      <w:r>
+        <w:t>The stream water was brownish to reddish-brown and visibly turbid, with suspended particles and sediment apparent in the flowing water.</w:t>
+      </w:r>
+    </w:p>
+    <w:p>
+      <w:pPr>
+        <w:pStyle w:val="ListBullet"/>
+        <w:spacing w:after="80"/>
+      </w:pPr>
+      <w:r>
+        <w:t>Both streams flow through a densely vegetated environment characterised by abundant trees, shrubs, ferns and other ground vegetation.</w:t>
+      </w:r>
+    </w:p>
+    <w:p>
+      <w:pPr>
+        <w:pStyle w:val="ListBullet"/>
+        <w:spacing w:after="80"/>
+      </w:pPr>
+      <w:r>
+        <w:t>The streambanks were uneven, with exposed soil, roots and areas of erosion visible along the channel.</w:t>
+      </w:r>
+    </w:p>
+    <w:p>
+      <w:pPr>
+        <w:pStyle w:val="ListBullet"/>
+        <w:spacing w:after="80"/>
+      </w:pPr>
+      <w:r>
+        <w:t>The presence of suspended sediment and the water’s discoloration may indicate soil erosion and sediment runoff into the stream, potentially influenced by rainfall and surface-water movement. However, the specific cause of the discoloration cannot be confirmed through visual observation alone.</w:t>
+      </w:r>
+    </w:p>
+    <w:p>
+      <w:pPr>
+        <w:pStyle w:val="ListBullet"/>
+        <w:spacing w:after="80"/>
+      </w:pPr>
+      <w:r>
+        <w:t>The surrounding vegetation provides natural streambank cover, although localised exposed soils and disturbed bank sections may contribute to sediment entering the water.</w:t>
+      </w:r>
+    </w:p>
+    <w:p>
+      <w:pPr>
+        <w:pStyle w:val="ListBullet"/>
+        <w:spacing w:after="80"/>
+      </w:pPr>
+      <w:r>
+        <w:t>Around the collection points along the Pompleh and Wehyee streams, there were no visible signs of possible environmental pollution due to mine runoff on the nearby farmlands.</w:t>
+      </w:r>
+    </w:p>
+    <w:p>
+      <w:pPr>
+        <w:pStyle w:val="ListBullet"/>
+        <w:spacing w:after="80"/>
+      </w:pPr>
+      <w:r>
+        <w:t>Water samples were collected for subsequent analysis to assess the streams’ water quality and determine whether their physical and chemical characteristics meet the applicable environmental standards.</w:t>
+      </w:r>
+    </w:p>
+    <w:p/>
+    <w:p>
+      <w:r>
+        <w:rPr>
+          <w:b/>
+        </w:rPr>
+        <w:t>Photographic documentation – VA group sampling points</w:t>
+      </w:r>
+    </w:p>
+    <w:tbl>
+      <w:tblPr>
+        <w:tblW w:type="auto" w:w="0"/>
+        <w:jc w:val="center"/>
+        <w:tblLook w:firstColumn="1" w:firstRow="1" w:lastColumn="0" w:lastRow="0" w:noHBand="0" w:noVBand="1" w:val="04A0"/>
+      </w:tblPr>
+      <w:tblGrid>
+        <w:gridCol w:w="7056"/>
+        <w:gridCol w:w="7056"/>
+      </w:tblGrid>
+      <w:tr>
+        <w:tc>
+          <w:tcPr>
+            <w:tcW w:type="dxa" w:w="7056"/>
+          </w:tcPr>
+          <w:p>
+            <w:pPr>
+              <w:jc w:val="center"/>
+            </w:pPr>
+            <w:r/>
+            <w:r>
+              <w:drawing>
+                <wp:inline xmlns:a="http://schemas.openxmlformats.org/drawingml/2006/main" xmlns:pic="http://schemas.openxmlformats.org/drawingml/2006/picture">
+                  <wp:extent cx="4470400" cy="2514600"/>
+                  <wp:docPr id="1" name="Picture 1"/>
+                  <wp:cNvGraphicFramePr>
+                    <a:graphicFrameLocks noChangeAspect="1"/>
+                  </wp:cNvGraphicFramePr>
+                  <a:graphic>
+                    <a:graphicData uri="http://schemas.openxmlformats.org/drawingml/2006/picture">
+                      <pic:pic>
+                        <pic:nvPicPr>
+                          <pic:cNvPr id="0" name="W-SW-VA-001_Wehyee_Downstream.jpg"/>
+                          <pic:cNvPicPr/>
+                        </pic:nvPicPr>
+                        <pic:blipFill>
+                          <a:blip r:embed="rId9"/>
+                          <a:stretch>
+                            <a:fillRect/>
+                          </a:stretch>
+                        </pic:blipFill>
+                        <pic:spPr>
+                          <a:xfrm>
+                            <a:off x="0" y="0"/>
+                            <a:ext cx="4470400" cy="2514600"/>
+                          </a:xfrm>
+                          <a:prstGeom prst="rect"/>
+                        </pic:spPr>
+                      </pic:pic>
+                    </a:graphicData>
+                  </a:graphic>
+                </wp:inline>
+              </w:drawing>
+            </w:r>
+          </w:p>
+          <w:p>
+            <w:pPr>
+              <w:jc w:val="center"/>
+            </w:pPr>
+            <w:r>
+              <w:rPr>
+                <w:i/>
+                <w:sz w:val="17"/>
+              </w:rPr>
+              <w:t>Plate 1: W-SW-VA-001 – Wehyee Downstream (7.5677, -8.6093; 2:58 PM). Reddish-brown, turbid flow.</w:t>
+            </w:r>
+          </w:p>
+        </w:tc>
+        <w:tc>
+          <w:tcPr>
+            <w:tcW w:type="dxa" w:w="7056"/>
+          </w:tcPr>
+          <w:p>
+            <w:pPr>
+              <w:jc w:val="center"/>
+            </w:pPr>
+            <w:r/>
+            <w:r>
+              <w:drawing>
+                <wp:inline xmlns:a="http://schemas.openxmlformats.org/drawingml/2006/main" xmlns:pic="http://schemas.openxmlformats.org/drawingml/2006/picture">
+                  <wp:extent cx="3208734" cy="2514600"/>
+                  <wp:docPr id="2" name="Picture 2"/>
+                  <wp:cNvGraphicFramePr>
+                    <a:graphicFrameLocks noChangeAspect="1"/>
+                  </wp:cNvGraphicFramePr>
+                  <a:graphic>
+                    <a:graphicData uri="http://schemas.openxmlformats.org/drawingml/2006/picture">
+                      <pic:pic>
+                        <pic:nvPicPr>
+                          <pic:cNvPr id="0" name="POM-SW-VA-002_Pompleh_Midpoint.jpg"/>
+                          <pic:cNvPicPr/>
+                        </pic:nvPicPr>
+                        <pic:blipFill>
+                          <a:blip r:embed="rId10"/>
+                          <a:stretch>
+                            <a:fillRect/>
+                          </a:stretch>
+                        </pic:blipFill>
+                        <pic:spPr>
+                          <a:xfrm>
+                            <a:off x="0" y="0"/>
+                            <a:ext cx="3208734" cy="2514600"/>
+                          </a:xfrm>
+                          <a:prstGeom prst="rect"/>
+                        </pic:spPr>
+                      </pic:pic>
+                    </a:graphicData>
+                  </a:graphic>
+                </wp:inline>
+              </w:drawing>
+            </w:r>
+          </w:p>
+          <w:p>
+            <w:pPr>
+              <w:jc w:val="center"/>
+            </w:pPr>
+            <w:r>
+              <w:rPr>
+                <w:i/>
+                <w:sz w:val="17"/>
+              </w:rPr>
+              <w:t>Plate 2: POM-SW-VA-002 – Pompleh Mid-point (7.5682, -8.6095; 3:07 PM). Sampling under dense ground cover.</w:t>
+            </w:r>
+          </w:p>
+        </w:tc>
+      </w:tr>
+      <w:tr>
+        <w:tc>
+          <w:tcPr>
+            <w:tcW w:type="dxa" w:w="7056"/>
+          </w:tcPr>
+          <w:p>
+            <w:pPr>
+              <w:jc w:val="center"/>
+            </w:pPr>
+            <w:r/>
+            <w:r>
+              <w:drawing>
+                <wp:inline xmlns:a="http://schemas.openxmlformats.org/drawingml/2006/main" xmlns:pic="http://schemas.openxmlformats.org/drawingml/2006/picture">
+                  <wp:extent cx="4470400" cy="2514600"/>
+                  <wp:docPr id="3" name="Picture 3"/>
+                  <wp:cNvGraphicFramePr>
+                    <a:graphicFrameLocks noChangeAspect="1"/>
+                  </wp:cNvGraphicFramePr>
+                  <a:graphic>
+                    <a:graphicData uri="http://schemas.openxmlformats.org/drawingml/2006/picture">
+                      <pic:pic>
+                        <pic:nvPicPr>
+                          <pic:cNvPr id="0" name="W-SW-VA-002_Wehyee_Midpoint.jpg"/>
+                          <pic:cNvPicPr/>
+                        </pic:nvPicPr>
+                        <pic:blipFill>
+                          <a:blip r:embed="rId11"/>
+                          <a:stretch>
+                            <a:fillRect/>
+                          </a:stretch>
+                        </pic:blipFill>
+                        <pic:spPr>
+                          <a:xfrm>
+                            <a:off x="0" y="0"/>
+                            <a:ext cx="4470400" cy="2514600"/>
+                          </a:xfrm>
+                          <a:prstGeom prst="rect"/>
+                        </pic:spPr>
+                      </pic:pic>
+                    </a:graphicData>
+                  </a:graphic>
+                </wp:inline>
+              </w:drawing>
+            </w:r>
+          </w:p>
+          <w:p>
+            <w:pPr>
+              <w:jc w:val="center"/>
+            </w:pPr>
+            <w:r>
+              <w:rPr>
+                <w:i/>
+                <w:sz w:val="17"/>
+              </w:rPr>
+              <w:t>Plate 3: W-SW-VA-002 – Wehyee Mid-point (7.5672, -8.6122; 3:16 PM). Suspended sediment in channel.</w:t>
+            </w:r>
+          </w:p>
+        </w:tc>
+        <w:tc>
+          <w:tcPr>
+            <w:tcW w:type="dxa" w:w="7056"/>
+          </w:tcPr>
+          <w:p>
+            <w:pPr>
+              <w:jc w:val="center"/>
+            </w:pPr>
+            <w:r/>
+            <w:r>
+              <w:drawing>
+                <wp:inline xmlns:a="http://schemas.openxmlformats.org/drawingml/2006/main" xmlns:pic="http://schemas.openxmlformats.org/drawingml/2006/picture">
+                  <wp:extent cx="3415737" cy="2514600"/>
+                  <wp:docPr id="4" name="Picture 4"/>
+                  <wp:cNvGraphicFramePr>
+                    <a:graphicFrameLocks noChangeAspect="1"/>
+                  </wp:cNvGraphicFramePr>
+                  <a:graphic>
+                    <a:graphicData uri="http://schemas.openxmlformats.org/drawingml/2006/picture">
+                      <pic:pic>
+                        <pic:nvPicPr>
+                          <pic:cNvPr id="0" name="W-SW-VA-003_Wehyee_Upstream.jpg"/>
+                          <pic:cNvPicPr/>
+                        </pic:nvPicPr>
+                        <pic:blipFill>
+                          <a:blip r:embed="rId12"/>
+                          <a:stretch>
+                            <a:fillRect/>
+                          </a:stretch>
+                        </pic:blipFill>
+                        <pic:spPr>
+                          <a:xfrm>
+                            <a:off x="0" y="0"/>
+                            <a:ext cx="3415737" cy="2514600"/>
+                          </a:xfrm>
+                          <a:prstGeom prst="rect"/>
+                        </pic:spPr>
+                      </pic:pic>
+                    </a:graphicData>
+                  </a:graphic>
+                </wp:inline>
+              </w:drawing>
+            </w:r>
+          </w:p>
+          <w:p>
+            <w:pPr>
+              <w:jc w:val="center"/>
+            </w:pPr>
+            <w:r>
+              <w:rPr>
+                <w:i/>
+                <w:sz w:val="17"/>
+              </w:rPr>
+              <w:t>Plate 4: W-SW-VA-003 – Wehyee Upstream (7.5672, -8.6129; 3:21 PM). Uneven banks with exposed soil.</w:t>
+            </w:r>
+          </w:p>
+        </w:tc>
+      </w:tr>
+    </w:tbl>
     <w:p>
       <w:r>
         <w:br w:type="page"/>

</xml_diff>